<commit_message>
Creacion tabla y carga de datos usuarios
</commit_message>
<xml_diff>
--- a/Base de Datos/Hito 0 Fabrica.docx
+++ b/Base de Datos/Hito 0 Fabrica.docx
@@ -36,12 +36,6 @@
         <w:gridCol w:w="9638"/>
       </w:tblGrid>
       <w:tr>
-        <w:tblPrEx>
-          <w:tblCellMar>
-            <w:top w:w="0" w:type="dxa"/>
-            <w:bottom w:w="0" w:type="dxa"/>
-          </w:tblCellMar>
-        </w:tblPrEx>
         <w:tc>
           <w:tcPr>
             <w:tcW w:w="9638" w:type="dxa"/>
@@ -99,12 +93,6 @@
         <w:gridCol w:w="6638"/>
       </w:tblGrid>
       <w:tr>
-        <w:tblPrEx>
-          <w:tblCellMar>
-            <w:top w:w="0" w:type="dxa"/>
-            <w:bottom w:w="0" w:type="dxa"/>
-          </w:tblCellMar>
-        </w:tblPrEx>
         <w:tc>
           <w:tcPr>
             <w:tcW w:w="3000" w:type="dxa"/>
@@ -161,12 +149,6 @@
         </w:tc>
       </w:tr>
       <w:tr>
-        <w:tblPrEx>
-          <w:tblCellMar>
-            <w:top w:w="0" w:type="dxa"/>
-            <w:bottom w:w="0" w:type="dxa"/>
-          </w:tblCellMar>
-        </w:tblPrEx>
         <w:tc>
           <w:tcPr>
             <w:tcW w:w="3000" w:type="dxa"/>
@@ -222,12 +204,6 @@
         </w:tc>
       </w:tr>
       <w:tr>
-        <w:tblPrEx>
-          <w:tblCellMar>
-            <w:top w:w="0" w:type="dxa"/>
-            <w:bottom w:w="0" w:type="dxa"/>
-          </w:tblCellMar>
-        </w:tblPrEx>
         <w:tc>
           <w:tcPr>
             <w:tcW w:w="3000" w:type="dxa"/>
@@ -271,88 +247,18 @@
             <w:pPr>
               <w:spacing w:after="40"/>
             </w:pPr>
-            <w:proofErr w:type="gramStart"/>
             <w:r>
               <w:rPr>
                 <w:rFonts w:ascii="Calibri" w:eastAsia="Calibri" w:hAnsi="Calibri" w:cs="Calibri"/>
                 <w:sz w:val="20"/>
                 <w:szCs w:val="20"/>
               </w:rPr>
-              <w:t>[ ]</w:t>
-            </w:r>
-            <w:proofErr w:type="gramEnd"/>
-            <w:r>
-              <w:rPr>
-                <w:rFonts w:ascii="Calibri" w:eastAsia="Calibri" w:hAnsi="Calibri" w:cs="Calibri"/>
-                <w:sz w:val="20"/>
-                <w:szCs w:val="20"/>
-              </w:rPr>
-              <w:t xml:space="preserve"> Opción A (Solo </w:t>
-            </w:r>
-            <w:proofErr w:type="gramStart"/>
-            <w:r>
-              <w:rPr>
-                <w:rFonts w:ascii="Calibri" w:eastAsia="Calibri" w:hAnsi="Calibri" w:cs="Calibri"/>
-                <w:sz w:val="20"/>
-                <w:szCs w:val="20"/>
-              </w:rPr>
-              <w:t xml:space="preserve">BD)   </w:t>
-            </w:r>
-            <w:proofErr w:type="gramEnd"/>
-            <w:r>
-              <w:rPr>
-                <w:rFonts w:ascii="Calibri" w:eastAsia="Calibri" w:hAnsi="Calibri" w:cs="Calibri"/>
-                <w:sz w:val="20"/>
-                <w:szCs w:val="20"/>
-              </w:rPr>
-              <w:t xml:space="preserve"> </w:t>
-            </w:r>
-            <w:proofErr w:type="gramStart"/>
-            <w:r>
-              <w:rPr>
-                <w:rFonts w:ascii="Calibri" w:eastAsia="Calibri" w:hAnsi="Calibri" w:cs="Calibri"/>
-                <w:sz w:val="20"/>
-                <w:szCs w:val="20"/>
-              </w:rPr>
-              <w:t>[ ]</w:t>
-            </w:r>
-            <w:proofErr w:type="gramEnd"/>
-            <w:r>
-              <w:rPr>
-                <w:rFonts w:ascii="Calibri" w:eastAsia="Calibri" w:hAnsi="Calibri" w:cs="Calibri"/>
-                <w:sz w:val="20"/>
-                <w:szCs w:val="20"/>
-              </w:rPr>
-              <w:t xml:space="preserve"> Opción B (Articulado con </w:t>
-            </w:r>
-            <w:proofErr w:type="spellStart"/>
-            <w:r>
-              <w:rPr>
-                <w:rFonts w:ascii="Calibri" w:eastAsia="Calibri" w:hAnsi="Calibri" w:cs="Calibri"/>
-                <w:sz w:val="20"/>
-                <w:szCs w:val="20"/>
-              </w:rPr>
-              <w:t>Prog</w:t>
-            </w:r>
-            <w:proofErr w:type="spellEnd"/>
-            <w:r>
-              <w:rPr>
-                <w:rFonts w:ascii="Calibri" w:eastAsia="Calibri" w:hAnsi="Calibri" w:cs="Calibri"/>
-                <w:sz w:val="20"/>
-                <w:szCs w:val="20"/>
-              </w:rPr>
-              <w:t>. I)</w:t>
+              <w:t>[ ] Opción A (Solo BD)    [ ] Opción B (Articulado con Prog. I)</w:t>
             </w:r>
           </w:p>
         </w:tc>
       </w:tr>
       <w:tr>
-        <w:tblPrEx>
-          <w:tblCellMar>
-            <w:top w:w="0" w:type="dxa"/>
-            <w:bottom w:w="0" w:type="dxa"/>
-          </w:tblCellMar>
-        </w:tblPrEx>
         <w:tc>
           <w:tcPr>
             <w:tcW w:w="3000" w:type="dxa"/>
@@ -396,70 +302,18 @@
             <w:pPr>
               <w:spacing w:after="40"/>
             </w:pPr>
-            <w:proofErr w:type="gramStart"/>
             <w:r>
               <w:rPr>
                 <w:rFonts w:ascii="Calibri" w:eastAsia="Calibri" w:hAnsi="Calibri" w:cs="Calibri"/>
                 <w:sz w:val="20"/>
                 <w:szCs w:val="20"/>
               </w:rPr>
-              <w:t>[ ]</w:t>
-            </w:r>
-            <w:proofErr w:type="gramEnd"/>
-            <w:r>
-              <w:rPr>
-                <w:rFonts w:ascii="Calibri" w:eastAsia="Calibri" w:hAnsi="Calibri" w:cs="Calibri"/>
-                <w:sz w:val="20"/>
-                <w:szCs w:val="20"/>
-              </w:rPr>
-              <w:t xml:space="preserve"> Desarrollo de Software </w:t>
-            </w:r>
-            <w:proofErr w:type="gramStart"/>
-            <w:r>
-              <w:rPr>
-                <w:rFonts w:ascii="Calibri" w:eastAsia="Calibri" w:hAnsi="Calibri" w:cs="Calibri"/>
-                <w:sz w:val="20"/>
-                <w:szCs w:val="20"/>
-              </w:rPr>
-              <w:t xml:space="preserve">   [</w:t>
-            </w:r>
-            <w:proofErr w:type="gramEnd"/>
-            <w:r>
-              <w:rPr>
-                <w:rFonts w:ascii="Calibri" w:eastAsia="Calibri" w:hAnsi="Calibri" w:cs="Calibri"/>
-                <w:sz w:val="20"/>
-                <w:szCs w:val="20"/>
-              </w:rPr>
-              <w:t xml:space="preserve"> ] IA </w:t>
-            </w:r>
-            <w:proofErr w:type="gramStart"/>
-            <w:r>
-              <w:rPr>
-                <w:rFonts w:ascii="Calibri" w:eastAsia="Calibri" w:hAnsi="Calibri" w:cs="Calibri"/>
-                <w:sz w:val="20"/>
-                <w:szCs w:val="20"/>
-              </w:rPr>
-              <w:t xml:space="preserve">   [</w:t>
-            </w:r>
-            <w:proofErr w:type="gramEnd"/>
-            <w:r>
-              <w:rPr>
-                <w:rFonts w:ascii="Calibri" w:eastAsia="Calibri" w:hAnsi="Calibri" w:cs="Calibri"/>
-                <w:sz w:val="20"/>
-                <w:szCs w:val="20"/>
-              </w:rPr>
-              <w:t xml:space="preserve"> ] Ciberseguridad</w:t>
+              <w:t>[ ] Desarrollo de Software    [ ] IA    [ ] Ciberseguridad</w:t>
             </w:r>
           </w:p>
         </w:tc>
       </w:tr>
       <w:tr>
-        <w:tblPrEx>
-          <w:tblCellMar>
-            <w:top w:w="0" w:type="dxa"/>
-            <w:bottom w:w="0" w:type="dxa"/>
-          </w:tblCellMar>
-        </w:tblPrEx>
         <w:tc>
           <w:tcPr>
             <w:tcW w:w="3000" w:type="dxa"/>
@@ -733,12 +587,6 @@
         <w:gridCol w:w="2400"/>
       </w:tblGrid>
       <w:tr>
-        <w:tblPrEx>
-          <w:tblCellMar>
-            <w:top w:w="0" w:type="dxa"/>
-            <w:bottom w:w="0" w:type="dxa"/>
-          </w:tblCellMar>
-        </w:tblPrEx>
         <w:tc>
           <w:tcPr>
             <w:tcW w:w="500" w:type="dxa"/>
@@ -755,7 +603,6 @@
             <w:pPr>
               <w:spacing w:after="40"/>
             </w:pPr>
-            <w:proofErr w:type="spellStart"/>
             <w:r>
               <w:rPr>
                 <w:rFonts w:ascii="Calibri" w:eastAsia="Calibri" w:hAnsi="Calibri" w:cs="Calibri"/>
@@ -767,7 +614,6 @@
               </w:rPr>
               <w:t>N°</w:t>
             </w:r>
-            <w:proofErr w:type="spellEnd"/>
           </w:p>
         </w:tc>
         <w:tc>
@@ -859,12 +705,6 @@
         </w:tc>
       </w:tr>
       <w:tr>
-        <w:tblPrEx>
-          <w:tblCellMar>
-            <w:top w:w="0" w:type="dxa"/>
-            <w:bottom w:w="0" w:type="dxa"/>
-          </w:tblCellMar>
-        </w:tblPrEx>
         <w:tc>
           <w:tcPr>
             <w:tcW w:w="500" w:type="dxa"/>
@@ -931,89 +771,43 @@
             <w:pPr>
               <w:spacing w:after="40"/>
             </w:pPr>
-            <w:proofErr w:type="spellStart"/>
             <w:r>
               <w:rPr>
                 <w:rFonts w:ascii="Calibri" w:eastAsia="Calibri" w:hAnsi="Calibri" w:cs="Calibri"/>
                 <w:sz w:val="20"/>
                 <w:szCs w:val="20"/>
               </w:rPr>
-              <w:t>dni</w:t>
-            </w:r>
-            <w:proofErr w:type="spellEnd"/>
+              <w:t>dni, nombre, telefono, fecha_nacimiento</w:t>
+            </w:r>
+          </w:p>
+        </w:tc>
+        <w:tc>
+          <w:tcPr>
+            <w:tcW w:w="2400" w:type="dxa"/>
+            <w:tcMar>
+              <w:top w:w="40" w:type="dxa"/>
+              <w:left w:w="80" w:type="dxa"/>
+              <w:bottom w:w="40" w:type="dxa"/>
+              <w:right w:w="80" w:type="dxa"/>
+            </w:tcMar>
+            <w:vAlign w:val="center"/>
+          </w:tcPr>
+          <w:p>
+            <w:pPr>
+              <w:spacing w:after="40"/>
+            </w:pPr>
             <w:r>
               <w:rPr>
                 <w:rFonts w:ascii="Calibri" w:eastAsia="Calibri" w:hAnsi="Calibri" w:cs="Calibri"/>
                 <w:sz w:val="20"/>
                 <w:szCs w:val="20"/>
               </w:rPr>
-              <w:t xml:space="preserve">, nombre, </w:t>
-            </w:r>
-            <w:proofErr w:type="spellStart"/>
-            <w:r>
-              <w:rPr>
-                <w:rFonts w:ascii="Calibri" w:eastAsia="Calibri" w:hAnsi="Calibri" w:cs="Calibri"/>
-                <w:sz w:val="20"/>
-                <w:szCs w:val="20"/>
-              </w:rPr>
-              <w:t>telefono</w:t>
-            </w:r>
-            <w:proofErr w:type="spellEnd"/>
-            <w:r>
-              <w:rPr>
-                <w:rFonts w:ascii="Calibri" w:eastAsia="Calibri" w:hAnsi="Calibri" w:cs="Calibri"/>
-                <w:sz w:val="20"/>
-                <w:szCs w:val="20"/>
-              </w:rPr>
-              <w:t xml:space="preserve">, </w:t>
-            </w:r>
-            <w:proofErr w:type="spellStart"/>
-            <w:r>
-              <w:rPr>
-                <w:rFonts w:ascii="Calibri" w:eastAsia="Calibri" w:hAnsi="Calibri" w:cs="Calibri"/>
-                <w:sz w:val="20"/>
-                <w:szCs w:val="20"/>
-              </w:rPr>
-              <w:t>fecha_nacimiento</w:t>
-            </w:r>
-            <w:proofErr w:type="spellEnd"/>
-          </w:p>
-        </w:tc>
-        <w:tc>
-          <w:tcPr>
-            <w:tcW w:w="2400" w:type="dxa"/>
-            <w:tcMar>
-              <w:top w:w="40" w:type="dxa"/>
-              <w:left w:w="80" w:type="dxa"/>
-              <w:bottom w:w="40" w:type="dxa"/>
-              <w:right w:w="80" w:type="dxa"/>
-            </w:tcMar>
-            <w:vAlign w:val="center"/>
-          </w:tcPr>
-          <w:p>
-            <w:pPr>
-              <w:spacing w:after="40"/>
-            </w:pPr>
-            <w:proofErr w:type="spellStart"/>
-            <w:r>
-              <w:rPr>
-                <w:rFonts w:ascii="Calibri" w:eastAsia="Calibri" w:hAnsi="Calibri" w:cs="Calibri"/>
-                <w:sz w:val="20"/>
-                <w:szCs w:val="20"/>
-              </w:rPr>
               <w:t>id_paciente</w:t>
             </w:r>
-            <w:proofErr w:type="spellEnd"/>
           </w:p>
         </w:tc>
       </w:tr>
       <w:tr>
-        <w:tblPrEx>
-          <w:tblCellMar>
-            <w:top w:w="0" w:type="dxa"/>
-            <w:bottom w:w="0" w:type="dxa"/>
-          </w:tblCellMar>
-        </w:tblPrEx>
         <w:tc>
           <w:tcPr>
             <w:tcW w:w="500" w:type="dxa"/>
@@ -1122,7 +916,6 @@
                 <w:szCs w:val="20"/>
               </w:rPr>
             </w:pPr>
-            <w:proofErr w:type="spellStart"/>
             <w:r>
               <w:rPr>
                 <w:sz w:val="20"/>
@@ -1137,17 +930,10 @@
               </w:rPr>
               <w:t>clientes</w:t>
             </w:r>
-            <w:proofErr w:type="spellEnd"/>
           </w:p>
         </w:tc>
       </w:tr>
       <w:tr>
-        <w:tblPrEx>
-          <w:tblCellMar>
-            <w:top w:w="0" w:type="dxa"/>
-            <w:bottom w:w="0" w:type="dxa"/>
-          </w:tblCellMar>
-        </w:tblPrEx>
         <w:tc>
           <w:tcPr>
             <w:tcW w:w="500" w:type="dxa"/>
@@ -1256,7 +1042,6 @@
                 <w:szCs w:val="20"/>
               </w:rPr>
             </w:pPr>
-            <w:proofErr w:type="spellStart"/>
             <w:r>
               <w:rPr>
                 <w:sz w:val="20"/>
@@ -1271,17 +1056,10 @@
               </w:rPr>
               <w:t>proveedor</w:t>
             </w:r>
-            <w:proofErr w:type="spellEnd"/>
           </w:p>
         </w:tc>
       </w:tr>
       <w:tr>
-        <w:tblPrEx>
-          <w:tblCellMar>
-            <w:top w:w="0" w:type="dxa"/>
-            <w:bottom w:w="0" w:type="dxa"/>
-          </w:tblCellMar>
-        </w:tblPrEx>
         <w:tc>
           <w:tcPr>
             <w:tcW w:w="500" w:type="dxa"/>
@@ -1360,23 +1138,7 @@
                 <w:sz w:val="20"/>
                 <w:szCs w:val="20"/>
               </w:rPr>
-              <w:t xml:space="preserve">Nombre, </w:t>
-            </w:r>
-            <w:proofErr w:type="spellStart"/>
-            <w:r>
-              <w:rPr>
-                <w:sz w:val="20"/>
-                <w:szCs w:val="20"/>
-              </w:rPr>
-              <w:t>unidad_medida</w:t>
-            </w:r>
-            <w:proofErr w:type="spellEnd"/>
-            <w:r>
-              <w:rPr>
-                <w:sz w:val="20"/>
-                <w:szCs w:val="20"/>
-              </w:rPr>
-              <w:t>, inventario</w:t>
+              <w:t>Nombre, unidad_medida, inventario</w:t>
             </w:r>
           </w:p>
         </w:tc>
@@ -1399,7 +1161,6 @@
                 <w:szCs w:val="20"/>
               </w:rPr>
             </w:pPr>
-            <w:proofErr w:type="spellStart"/>
             <w:r>
               <w:rPr>
                 <w:sz w:val="20"/>
@@ -1414,17 +1175,10 @@
               </w:rPr>
               <w:t>insumos</w:t>
             </w:r>
-            <w:proofErr w:type="spellEnd"/>
           </w:p>
         </w:tc>
       </w:tr>
       <w:tr>
-        <w:tblPrEx>
-          <w:tblCellMar>
-            <w:top w:w="0" w:type="dxa"/>
-            <w:bottom w:w="0" w:type="dxa"/>
-          </w:tblCellMar>
-        </w:tblPrEx>
         <w:tc>
           <w:tcPr>
             <w:tcW w:w="500" w:type="dxa"/>
@@ -1527,7 +1281,6 @@
                 <w:szCs w:val="20"/>
               </w:rPr>
             </w:pPr>
-            <w:proofErr w:type="spellStart"/>
             <w:r>
               <w:rPr>
                 <w:sz w:val="20"/>
@@ -1542,17 +1295,10 @@
               </w:rPr>
               <w:t>producto</w:t>
             </w:r>
-            <w:proofErr w:type="spellEnd"/>
           </w:p>
         </w:tc>
       </w:tr>
       <w:tr>
-        <w:tblPrEx>
-          <w:tblCellMar>
-            <w:top w:w="0" w:type="dxa"/>
-            <w:bottom w:w="0" w:type="dxa"/>
-          </w:tblCellMar>
-        </w:tblPrEx>
         <w:tc>
           <w:tcPr>
             <w:tcW w:w="500" w:type="dxa"/>
@@ -1661,7 +1407,6 @@
                 <w:szCs w:val="20"/>
               </w:rPr>
             </w:pPr>
-            <w:proofErr w:type="spellStart"/>
             <w:r>
               <w:rPr>
                 <w:sz w:val="20"/>
@@ -1674,26 +1419,12 @@
                 <w:sz w:val="20"/>
                 <w:szCs w:val="20"/>
               </w:rPr>
-              <w:t>cliente</w:t>
-            </w:r>
-            <w:proofErr w:type="spellEnd"/>
-            <w:r>
-              <w:rPr>
-                <w:sz w:val="20"/>
-                <w:szCs w:val="20"/>
-              </w:rPr>
-              <w:t xml:space="preserve"> (FK)</w:t>
+              <w:t>cliente (FK)</w:t>
             </w:r>
           </w:p>
         </w:tc>
       </w:tr>
       <w:tr>
-        <w:tblPrEx>
-          <w:tblCellMar>
-            <w:top w:w="0" w:type="dxa"/>
-            <w:bottom w:w="0" w:type="dxa"/>
-          </w:tblCellMar>
-        </w:tblPrEx>
         <w:tc>
           <w:tcPr>
             <w:tcW w:w="500" w:type="dxa"/>
@@ -1744,7 +1475,6 @@
                 <w:szCs w:val="20"/>
               </w:rPr>
             </w:pPr>
-            <w:proofErr w:type="spellStart"/>
             <w:r>
               <w:rPr>
                 <w:sz w:val="20"/>
@@ -1752,7 +1482,6 @@
               </w:rPr>
               <w:t>Detalle_venta</w:t>
             </w:r>
-            <w:proofErr w:type="spellEnd"/>
           </w:p>
         </w:tc>
         <w:tc>
@@ -1779,17 +1508,8 @@
                 <w:sz w:val="20"/>
                 <w:szCs w:val="20"/>
               </w:rPr>
-              <w:t xml:space="preserve">Cantidad, </w:t>
-            </w:r>
-            <w:proofErr w:type="spellStart"/>
-            <w:r>
-              <w:rPr>
-                <w:sz w:val="20"/>
-                <w:szCs w:val="20"/>
-              </w:rPr>
-              <w:t>precio_unitario</w:t>
-            </w:r>
-            <w:proofErr w:type="spellEnd"/>
+              <w:t>Cantidad, precio_unitario</w:t>
+            </w:r>
           </w:p>
         </w:tc>
         <w:tc>
@@ -1811,7 +1531,6 @@
                 <w:szCs w:val="20"/>
               </w:rPr>
             </w:pPr>
-            <w:proofErr w:type="spellStart"/>
             <w:r>
               <w:rPr>
                 <w:sz w:val="20"/>
@@ -1819,17 +1538,15 @@
               </w:rPr>
               <w:t>Id_venta</w:t>
             </w:r>
-            <w:proofErr w:type="spellEnd"/>
-          </w:p>
-          <w:p>
-            <w:pPr>
-              <w:spacing w:after="40"/>
-              <w:rPr>
-                <w:sz w:val="20"/>
-                <w:szCs w:val="20"/>
-              </w:rPr>
-            </w:pPr>
-            <w:proofErr w:type="spellStart"/>
+          </w:p>
+          <w:p>
+            <w:pPr>
+              <w:spacing w:after="40"/>
+              <w:rPr>
+                <w:sz w:val="20"/>
+                <w:szCs w:val="20"/>
+              </w:rPr>
+            </w:pPr>
             <w:r>
               <w:rPr>
                 <w:sz w:val="20"/>
@@ -1837,17 +1554,10 @@
               </w:rPr>
               <w:t>Id_producto</w:t>
             </w:r>
-            <w:proofErr w:type="spellEnd"/>
           </w:p>
         </w:tc>
       </w:tr>
       <w:tr>
-        <w:tblPrEx>
-          <w:tblCellMar>
-            <w:top w:w="0" w:type="dxa"/>
-            <w:bottom w:w="0" w:type="dxa"/>
-          </w:tblCellMar>
-        </w:tblPrEx>
         <w:tc>
           <w:tcPr>
             <w:tcW w:w="500" w:type="dxa"/>
@@ -1954,7 +1664,6 @@
                 <w:szCs w:val="20"/>
               </w:rPr>
             </w:pPr>
-            <w:proofErr w:type="spellStart"/>
             <w:r>
               <w:rPr>
                 <w:sz w:val="20"/>
@@ -1962,42 +1671,26 @@
               </w:rPr>
               <w:t>Id_compra</w:t>
             </w:r>
-            <w:proofErr w:type="spellEnd"/>
-          </w:p>
-          <w:p>
-            <w:pPr>
-              <w:spacing w:after="40"/>
-              <w:rPr>
-                <w:sz w:val="20"/>
-                <w:szCs w:val="20"/>
-              </w:rPr>
-            </w:pPr>
-            <w:proofErr w:type="spellStart"/>
-            <w:r>
-              <w:rPr>
-                <w:sz w:val="20"/>
-                <w:szCs w:val="20"/>
-              </w:rPr>
-              <w:t>Id_insumo</w:t>
-            </w:r>
-            <w:proofErr w:type="spellEnd"/>
-            <w:r>
-              <w:rPr>
-                <w:sz w:val="20"/>
-                <w:szCs w:val="20"/>
-              </w:rPr>
-              <w:t xml:space="preserve"> (FK)</w:t>
+          </w:p>
+          <w:p>
+            <w:pPr>
+              <w:spacing w:after="40"/>
+              <w:rPr>
+                <w:sz w:val="20"/>
+                <w:szCs w:val="20"/>
+              </w:rPr>
+            </w:pPr>
+            <w:r>
+              <w:rPr>
+                <w:sz w:val="20"/>
+                <w:szCs w:val="20"/>
+              </w:rPr>
+              <w:t>Id_insumo (FK)</w:t>
             </w:r>
           </w:p>
         </w:tc>
       </w:tr>
       <w:tr>
-        <w:tblPrEx>
-          <w:tblCellMar>
-            <w:top w:w="0" w:type="dxa"/>
-            <w:bottom w:w="0" w:type="dxa"/>
-          </w:tblCellMar>
-        </w:tblPrEx>
         <w:tc>
           <w:tcPr>
             <w:tcW w:w="500" w:type="dxa"/>
@@ -2048,7 +1741,6 @@
                 <w:szCs w:val="20"/>
               </w:rPr>
             </w:pPr>
-            <w:proofErr w:type="spellStart"/>
             <w:r>
               <w:rPr>
                 <w:sz w:val="20"/>
@@ -2056,7 +1748,6 @@
               </w:rPr>
               <w:t>Detalle_compra</w:t>
             </w:r>
-            <w:proofErr w:type="spellEnd"/>
           </w:p>
         </w:tc>
         <w:tc>
@@ -2083,17 +1774,8 @@
                 <w:sz w:val="20"/>
                 <w:szCs w:val="20"/>
               </w:rPr>
-              <w:t xml:space="preserve">Cantidad, </w:t>
-            </w:r>
-            <w:proofErr w:type="spellStart"/>
-            <w:r>
-              <w:rPr>
-                <w:sz w:val="20"/>
-                <w:szCs w:val="20"/>
-              </w:rPr>
-              <w:t>precio_unitario</w:t>
-            </w:r>
-            <w:proofErr w:type="spellEnd"/>
+              <w:t>Cantidad, precio_unitario</w:t>
+            </w:r>
           </w:p>
         </w:tc>
         <w:tc>
@@ -2115,7 +1797,6 @@
                 <w:szCs w:val="20"/>
               </w:rPr>
             </w:pPr>
-            <w:proofErr w:type="spellStart"/>
             <w:r>
               <w:rPr>
                 <w:sz w:val="20"/>
@@ -2123,17 +1804,15 @@
               </w:rPr>
               <w:t>Id_compra</w:t>
             </w:r>
-            <w:proofErr w:type="spellEnd"/>
-          </w:p>
-          <w:p>
-            <w:pPr>
-              <w:spacing w:after="40"/>
-              <w:rPr>
-                <w:sz w:val="20"/>
-                <w:szCs w:val="20"/>
-              </w:rPr>
-            </w:pPr>
-            <w:proofErr w:type="spellStart"/>
+          </w:p>
+          <w:p>
+            <w:pPr>
+              <w:spacing w:after="40"/>
+              <w:rPr>
+                <w:sz w:val="20"/>
+                <w:szCs w:val="20"/>
+              </w:rPr>
+            </w:pPr>
             <w:r>
               <w:rPr>
                 <w:sz w:val="20"/>
@@ -2141,17 +1820,10 @@
               </w:rPr>
               <w:t>Id_insumo</w:t>
             </w:r>
-            <w:proofErr w:type="spellEnd"/>
           </w:p>
         </w:tc>
       </w:tr>
       <w:tr>
-        <w:tblPrEx>
-          <w:tblCellMar>
-            <w:top w:w="0" w:type="dxa"/>
-            <w:bottom w:w="0" w:type="dxa"/>
-          </w:tblCellMar>
-        </w:tblPrEx>
         <w:tc>
           <w:tcPr>
             <w:tcW w:w="500" w:type="dxa"/>
@@ -2230,7 +1902,6 @@
                 <w:szCs w:val="20"/>
               </w:rPr>
             </w:pPr>
-            <w:proofErr w:type="spellStart"/>
             <w:r>
               <w:rPr>
                 <w:sz w:val="20"/>
@@ -2238,7 +1909,6 @@
               </w:rPr>
               <w:t>Cantidad_elaboración</w:t>
             </w:r>
-            <w:proofErr w:type="spellEnd"/>
           </w:p>
         </w:tc>
         <w:tc>
@@ -2260,7 +1930,6 @@
                 <w:szCs w:val="20"/>
               </w:rPr>
             </w:pPr>
-            <w:proofErr w:type="spellStart"/>
             <w:r>
               <w:rPr>
                 <w:sz w:val="20"/>
@@ -2268,83 +1937,42 @@
               </w:rPr>
               <w:t>Id_receta</w:t>
             </w:r>
-            <w:proofErr w:type="spellEnd"/>
-          </w:p>
-          <w:p>
-            <w:pPr>
-              <w:spacing w:after="40"/>
-              <w:rPr>
-                <w:sz w:val="20"/>
-                <w:szCs w:val="20"/>
-              </w:rPr>
-            </w:pPr>
-            <w:proofErr w:type="spellStart"/>
-            <w:r>
-              <w:rPr>
-                <w:sz w:val="20"/>
-                <w:szCs w:val="20"/>
-              </w:rPr>
-              <w:t>Id_producto</w:t>
-            </w:r>
-            <w:proofErr w:type="spellEnd"/>
-            <w:r>
-              <w:rPr>
-                <w:sz w:val="20"/>
-                <w:szCs w:val="20"/>
-              </w:rPr>
-              <w:t xml:space="preserve"> (FK)</w:t>
-            </w:r>
-          </w:p>
-          <w:p>
-            <w:pPr>
-              <w:spacing w:after="40"/>
-              <w:rPr>
-                <w:sz w:val="20"/>
-                <w:szCs w:val="20"/>
-              </w:rPr>
-            </w:pPr>
-            <w:proofErr w:type="spellStart"/>
-            <w:r>
-              <w:rPr>
-                <w:sz w:val="20"/>
-                <w:szCs w:val="20"/>
-              </w:rPr>
-              <w:t>Id_</w:t>
-            </w:r>
-            <w:proofErr w:type="gramStart"/>
-            <w:r>
-              <w:rPr>
-                <w:sz w:val="20"/>
-                <w:szCs w:val="20"/>
-              </w:rPr>
-              <w:t>insumo</w:t>
-            </w:r>
-            <w:proofErr w:type="spellEnd"/>
-            <w:r>
-              <w:rPr>
-                <w:sz w:val="20"/>
-                <w:szCs w:val="20"/>
-              </w:rPr>
-              <w:t>(</w:t>
-            </w:r>
-            <w:proofErr w:type="gramEnd"/>
-            <w:r>
-              <w:rPr>
-                <w:sz w:val="20"/>
-                <w:szCs w:val="20"/>
-              </w:rPr>
-              <w:t>FK)</w:t>
+          </w:p>
+          <w:p>
+            <w:pPr>
+              <w:spacing w:after="40"/>
+              <w:rPr>
+                <w:sz w:val="20"/>
+                <w:szCs w:val="20"/>
+              </w:rPr>
+            </w:pPr>
+            <w:r>
+              <w:rPr>
+                <w:sz w:val="20"/>
+                <w:szCs w:val="20"/>
+              </w:rPr>
+              <w:t>Id_producto (FK)</w:t>
+            </w:r>
+          </w:p>
+          <w:p>
+            <w:pPr>
+              <w:spacing w:after="40"/>
+              <w:rPr>
+                <w:sz w:val="20"/>
+                <w:szCs w:val="20"/>
+              </w:rPr>
+            </w:pPr>
+            <w:r>
+              <w:rPr>
+                <w:sz w:val="20"/>
+                <w:szCs w:val="20"/>
+              </w:rPr>
+              <w:t>Id_insumo(FK)</w:t>
             </w:r>
           </w:p>
         </w:tc>
       </w:tr>
       <w:tr>
-        <w:tblPrEx>
-          <w:tblCellMar>
-            <w:top w:w="0" w:type="dxa"/>
-            <w:bottom w:w="0" w:type="dxa"/>
-          </w:tblCellMar>
-        </w:tblPrEx>
         <w:tc>
           <w:tcPr>
             <w:tcW w:w="500" w:type="dxa"/>
@@ -2428,23 +2056,7 @@
                 <w:sz w:val="20"/>
                 <w:szCs w:val="20"/>
               </w:rPr>
-              <w:t xml:space="preserve">Fecha, </w:t>
-            </w:r>
-            <w:proofErr w:type="spellStart"/>
-            <w:r>
-              <w:rPr>
-                <w:sz w:val="20"/>
-                <w:szCs w:val="20"/>
-              </w:rPr>
-              <w:t>cantidad_produccion</w:t>
-            </w:r>
-            <w:proofErr w:type="spellEnd"/>
-            <w:r>
-              <w:rPr>
-                <w:sz w:val="20"/>
-                <w:szCs w:val="20"/>
-              </w:rPr>
-              <w:t>, estado</w:t>
+              <w:t>Fecha, cantidad_produccion, estado</w:t>
             </w:r>
           </w:p>
         </w:tc>
@@ -2467,48 +2079,22 @@
                 <w:szCs w:val="20"/>
               </w:rPr>
             </w:pPr>
-            <w:proofErr w:type="spellStart"/>
-            <w:r>
-              <w:rPr>
-                <w:sz w:val="20"/>
-                <w:szCs w:val="20"/>
-              </w:rPr>
-              <w:t>Id_</w:t>
-            </w:r>
-            <w:proofErr w:type="gramStart"/>
-            <w:r>
-              <w:rPr>
-                <w:sz w:val="20"/>
-                <w:szCs w:val="20"/>
-              </w:rPr>
-              <w:t>producto</w:t>
-            </w:r>
-            <w:proofErr w:type="spellEnd"/>
-            <w:r>
-              <w:rPr>
-                <w:sz w:val="20"/>
-                <w:szCs w:val="20"/>
-              </w:rPr>
-              <w:t>(</w:t>
-            </w:r>
-            <w:proofErr w:type="gramEnd"/>
-            <w:r>
-              <w:rPr>
-                <w:sz w:val="20"/>
-                <w:szCs w:val="20"/>
-              </w:rPr>
-              <w:t>FK)</w:t>
-            </w:r>
-          </w:p>
-          <w:p>
-            <w:pPr>
-              <w:spacing w:after="40"/>
-              <w:rPr>
-                <w:sz w:val="20"/>
-                <w:szCs w:val="20"/>
-              </w:rPr>
-            </w:pPr>
-            <w:proofErr w:type="spellStart"/>
+            <w:r>
+              <w:rPr>
+                <w:sz w:val="20"/>
+                <w:szCs w:val="20"/>
+              </w:rPr>
+              <w:t>Id_producto(FK)</w:t>
+            </w:r>
+          </w:p>
+          <w:p>
+            <w:pPr>
+              <w:spacing w:after="40"/>
+              <w:rPr>
+                <w:sz w:val="20"/>
+                <w:szCs w:val="20"/>
+              </w:rPr>
+            </w:pPr>
             <w:r>
               <w:rPr>
                 <w:sz w:val="20"/>
@@ -2516,7 +2102,6 @@
               </w:rPr>
               <w:t>Id_elaboración</w:t>
             </w:r>
-            <w:proofErr w:type="spellEnd"/>
           </w:p>
         </w:tc>
       </w:tr>
@@ -2536,40 +2121,7 @@
           <w:sz w:val="22"/>
           <w:szCs w:val="22"/>
         </w:rPr>
-        <w:t xml:space="preserve"> </w:t>
-      </w:r>
-      <w:r>
-        <w:rPr>
-          <w:rFonts w:ascii="Calibri" w:eastAsia="Calibri" w:hAnsi="Calibri" w:cs="Calibri"/>
-          <w:b/>
-          <w:bCs/>
-          <w:color w:val="1F4E79"/>
-          <w:sz w:val="22"/>
-          <w:szCs w:val="22"/>
-        </w:rPr>
-        <w:t xml:space="preserve">4 </w:t>
-      </w:r>
-      <w:r>
-        <w:rPr>
-          <w:rFonts w:ascii="Calibri" w:eastAsia="Calibri" w:hAnsi="Calibri" w:cs="Calibri"/>
-          <w:b/>
-          <w:bCs/>
-          <w:color w:val="1F4E79"/>
-          <w:sz w:val="22"/>
-          <w:szCs w:val="22"/>
-        </w:rPr>
-        <w:t>- Relaciones</w:t>
-      </w:r>
-      <w:r>
-        <w:rPr>
-          <w:rFonts w:ascii="Calibri" w:eastAsia="Calibri" w:hAnsi="Calibri" w:cs="Calibri"/>
-          <w:b/>
-          <w:bCs/>
-          <w:color w:val="1F4E79"/>
-          <w:sz w:val="22"/>
-          <w:szCs w:val="22"/>
-        </w:rPr>
-        <w:t xml:space="preserve"> entre Entidades</w:t>
+        <w:t xml:space="preserve"> 4 - Relaciones entre Entidades</w:t>
       </w:r>
     </w:p>
     <w:p>
@@ -2602,12 +2154,6 @@
         <w:gridCol w:w="2138"/>
       </w:tblGrid>
       <w:tr>
-        <w:tblPrEx>
-          <w:tblCellMar>
-            <w:top w:w="0" w:type="dxa"/>
-            <w:bottom w:w="0" w:type="dxa"/>
-          </w:tblCellMar>
-        </w:tblPrEx>
         <w:tc>
           <w:tcPr>
             <w:tcW w:w="2000" w:type="dxa"/>
@@ -2755,12 +2301,6 @@
         </w:tc>
       </w:tr>
       <w:tr>
-        <w:tblPrEx>
-          <w:tblCellMar>
-            <w:top w:w="0" w:type="dxa"/>
-            <w:bottom w:w="0" w:type="dxa"/>
-          </w:tblCellMar>
-        </w:tblPrEx>
         <w:tc>
           <w:tcPr>
             <w:tcW w:w="2000" w:type="dxa"/>
@@ -2850,7 +2390,6 @@
               <w:spacing w:after="40"/>
               <w:jc w:val="center"/>
             </w:pPr>
-            <w:proofErr w:type="gramStart"/>
             <w:r>
               <w:rPr>
                 <w:rFonts w:ascii="Calibri" w:eastAsia="Calibri" w:hAnsi="Calibri" w:cs="Calibri"/>
@@ -2859,7 +2398,6 @@
               </w:rPr>
               <w:t>1:N</w:t>
             </w:r>
-            <w:proofErr w:type="gramEnd"/>
           </w:p>
         </w:tc>
         <w:tc>
@@ -2913,12 +2451,6 @@
         </w:tc>
       </w:tr>
       <w:tr>
-        <w:tblPrEx>
-          <w:tblCellMar>
-            <w:top w:w="0" w:type="dxa"/>
-            <w:bottom w:w="0" w:type="dxa"/>
-          </w:tblCellMar>
-        </w:tblPrEx>
         <w:tc>
           <w:tcPr>
             <w:tcW w:w="2000" w:type="dxa"/>
@@ -2994,11 +2526,9 @@
             <w:pPr>
               <w:spacing w:after="40"/>
             </w:pPr>
-            <w:proofErr w:type="gramStart"/>
             <w:r>
               <w:t>N:N</w:t>
             </w:r>
-            <w:proofErr w:type="gramEnd"/>
           </w:p>
         </w:tc>
         <w:tc>
@@ -3023,12 +2553,6 @@
         </w:tc>
       </w:tr>
       <w:tr>
-        <w:tblPrEx>
-          <w:tblCellMar>
-            <w:top w:w="0" w:type="dxa"/>
-            <w:bottom w:w="0" w:type="dxa"/>
-          </w:tblCellMar>
-        </w:tblPrEx>
         <w:tc>
           <w:tcPr>
             <w:tcW w:w="2000" w:type="dxa"/>
@@ -3104,11 +2628,9 @@
             <w:pPr>
               <w:spacing w:after="40"/>
             </w:pPr>
-            <w:proofErr w:type="gramStart"/>
             <w:r>
               <w:t>N:N</w:t>
             </w:r>
-            <w:proofErr w:type="gramEnd"/>
           </w:p>
         </w:tc>
         <w:tc>
@@ -3127,27 +2649,12 @@
               <w:spacing w:after="40"/>
             </w:pPr>
             <w:r>
-              <w:t>Much</w:t>
-            </w:r>
-            <w:r>
-              <w:t>os productos</w:t>
-            </w:r>
-            <w:r>
-              <w:t xml:space="preserve"> pueden tener muchos </w:t>
-            </w:r>
-            <w:r>
-              <w:t>insumos</w:t>
+              <w:t>Muchos productos pueden tener muchos insumos</w:t>
             </w:r>
           </w:p>
         </w:tc>
       </w:tr>
       <w:tr>
-        <w:tblPrEx>
-          <w:tblCellMar>
-            <w:top w:w="0" w:type="dxa"/>
-            <w:bottom w:w="0" w:type="dxa"/>
-          </w:tblCellMar>
-        </w:tblPrEx>
         <w:tc>
           <w:tcPr>
             <w:tcW w:w="2000" w:type="dxa"/>
@@ -3226,11 +2733,9 @@
             <w:pPr>
               <w:spacing w:after="40"/>
             </w:pPr>
-            <w:proofErr w:type="gramStart"/>
             <w:r>
               <w:t>1:N</w:t>
             </w:r>
-            <w:proofErr w:type="gramEnd"/>
           </w:p>
         </w:tc>
         <w:tc>
@@ -3255,12 +2760,6 @@
         </w:tc>
       </w:tr>
       <w:tr>
-        <w:tblPrEx>
-          <w:tblCellMar>
-            <w:top w:w="0" w:type="dxa"/>
-            <w:bottom w:w="0" w:type="dxa"/>
-          </w:tblCellMar>
-        </w:tblPrEx>
         <w:tc>
           <w:tcPr>
             <w:tcW w:w="2000" w:type="dxa"/>
@@ -3336,11 +2835,9 @@
             <w:pPr>
               <w:spacing w:after="40"/>
             </w:pPr>
-            <w:proofErr w:type="gramStart"/>
             <w:r>
               <w:t>N:N</w:t>
             </w:r>
-            <w:proofErr w:type="gramEnd"/>
           </w:p>
         </w:tc>
         <w:tc>
@@ -3359,23 +2856,12 @@
               <w:spacing w:after="40"/>
             </w:pPr>
             <w:r>
-              <w:t xml:space="preserve">Muchos </w:t>
-            </w:r>
-            <w:proofErr w:type="spellStart"/>
-            <w:r>
-              <w:t>ins</w:t>
-            </w:r>
-            <w:proofErr w:type="spellEnd"/>
+              <w:t>Muchos ins</w:t>
+            </w:r>
           </w:p>
         </w:tc>
       </w:tr>
       <w:tr>
-        <w:tblPrEx>
-          <w:tblCellMar>
-            <w:top w:w="0" w:type="dxa"/>
-            <w:bottom w:w="0" w:type="dxa"/>
-          </w:tblCellMar>
-        </w:tblPrEx>
         <w:tc>
           <w:tcPr>
             <w:tcW w:w="2000" w:type="dxa"/>
@@ -3451,11 +2937,9 @@
             <w:pPr>
               <w:spacing w:after="40"/>
             </w:pPr>
-            <w:proofErr w:type="gramStart"/>
             <w:r>
               <w:t>1:N</w:t>
             </w:r>
-            <w:proofErr w:type="gramEnd"/>
           </w:p>
         </w:tc>
         <w:tc>
@@ -3499,9 +2983,57 @@
           <w:sz w:val="22"/>
           <w:szCs w:val="22"/>
         </w:rPr>
-        <w:t xml:space="preserve">5 </w:t>
+        <w:lastRenderedPageBreak/>
+        <w:t>5 Esbozo del Modelo Relacional</w:t>
       </w:r>
-      <w:proofErr w:type="gramStart"/>
+    </w:p>
+    <w:p>
+      <w:pPr>
+        <w:spacing w:after="40"/>
+      </w:pPr>
+      <w:r>
+        <w:drawing>
+          <wp:inline distT="0" distB="0" distL="0" distR="0" wp14:anchorId="658BABB5" wp14:editId="53E52256">
+            <wp:extent cx="5400040" cy="3618230"/>
+            <wp:effectExtent l="0" t="0" r="0" b="1270"/>
+            <wp:docPr id="1298207111" name="Imagen 1"/>
+            <wp:cNvGraphicFramePr>
+              <a:graphicFrameLocks xmlns:a="http://schemas.openxmlformats.org/drawingml/2006/main" noChangeAspect="1"/>
+            </wp:cNvGraphicFramePr>
+            <a:graphic xmlns:a="http://schemas.openxmlformats.org/drawingml/2006/main">
+              <a:graphicData uri="http://schemas.openxmlformats.org/drawingml/2006/picture">
+                <pic:pic xmlns:pic="http://schemas.openxmlformats.org/drawingml/2006/picture">
+                  <pic:nvPicPr>
+                    <pic:cNvPr id="1298207111" name=""/>
+                    <pic:cNvPicPr/>
+                  </pic:nvPicPr>
+                  <pic:blipFill>
+                    <a:blip r:embed="rId6"/>
+                    <a:stretch>
+                      <a:fillRect/>
+                    </a:stretch>
+                  </pic:blipFill>
+                  <pic:spPr>
+                    <a:xfrm>
+                      <a:off x="0" y="0"/>
+                      <a:ext cx="5400040" cy="3618230"/>
+                    </a:xfrm>
+                    <a:prstGeom prst="rect">
+                      <a:avLst/>
+                    </a:prstGeom>
+                  </pic:spPr>
+                </pic:pic>
+              </a:graphicData>
+            </a:graphic>
+          </wp:inline>
+        </w:drawing>
+      </w:r>
+    </w:p>
+    <w:p>
+      <w:pPr>
+        <w:pStyle w:val="Ttulo3"/>
+        <w:spacing w:before="240" w:after="120"/>
+      </w:pPr>
       <w:r>
         <w:rPr>
           <w:rFonts w:ascii="Calibri" w:eastAsia="Calibri" w:hAnsi="Calibri" w:cs="Calibri"/>
@@ -3511,824 +3043,7 @@
           <w:sz w:val="22"/>
           <w:szCs w:val="22"/>
         </w:rPr>
-        <w:t>Esbozo</w:t>
-      </w:r>
-      <w:proofErr w:type="gramEnd"/>
-      <w:r>
-        <w:rPr>
-          <w:rFonts w:ascii="Calibri" w:eastAsia="Calibri" w:hAnsi="Calibri" w:cs="Calibri"/>
-          <w:b/>
-          <w:bCs/>
-          <w:color w:val="1F4E79"/>
-          <w:sz w:val="22"/>
-          <w:szCs w:val="22"/>
-        </w:rPr>
-        <w:t xml:space="preserve"> del Modelo Relacional</w:t>
-      </w:r>
-    </w:p>
-    <w:p>
-      <w:pPr>
-        <w:spacing w:after="40"/>
-      </w:pPr>
-    </w:p>
-    <w:tbl>
-      <w:tblPr>
-        <w:tblW w:w="9638" w:type="dxa"/>
-        <w:tblBorders>
-          <w:top w:val="single" w:sz="4" w:space="0" w:color="auto"/>
-          <w:left w:val="single" w:sz="4" w:space="0" w:color="auto"/>
-          <w:bottom w:val="single" w:sz="4" w:space="0" w:color="auto"/>
-          <w:right w:val="single" w:sz="4" w:space="0" w:color="auto"/>
-          <w:insideH w:val="single" w:sz="4" w:space="0" w:color="auto"/>
-          <w:insideV w:val="single" w:sz="4" w:space="0" w:color="auto"/>
-        </w:tblBorders>
-        <w:tblCellMar>
-          <w:left w:w="10" w:type="dxa"/>
-          <w:right w:w="10" w:type="dxa"/>
-        </w:tblCellMar>
-        <w:tblLook w:val="04A0" w:firstRow="1" w:lastRow="0" w:firstColumn="1" w:lastColumn="0" w:noHBand="0" w:noVBand="1"/>
-      </w:tblPr>
-      <w:tblGrid>
-        <w:gridCol w:w="1980"/>
-        <w:gridCol w:w="2835"/>
-        <w:gridCol w:w="4823"/>
-      </w:tblGrid>
-      <w:tr>
-        <w:tblPrEx>
-          <w:tblCellMar>
-            <w:top w:w="0" w:type="dxa"/>
-            <w:bottom w:w="0" w:type="dxa"/>
-          </w:tblCellMar>
-        </w:tblPrEx>
-        <w:tc>
-          <w:tcPr>
-            <w:tcW w:w="1980" w:type="dxa"/>
-            <w:shd w:val="clear" w:color="auto" w:fill="1F4E79"/>
-            <w:tcMar>
-              <w:top w:w="40" w:type="dxa"/>
-              <w:left w:w="80" w:type="dxa"/>
-              <w:bottom w:w="40" w:type="dxa"/>
-              <w:right w:w="80" w:type="dxa"/>
-            </w:tcMar>
-            <w:vAlign w:val="center"/>
-          </w:tcPr>
-          <w:p>
-            <w:pPr>
-              <w:spacing w:after="40"/>
-            </w:pPr>
-            <w:r>
-              <w:rPr>
-                <w:rFonts w:ascii="Calibri" w:eastAsia="Calibri" w:hAnsi="Calibri" w:cs="Calibri"/>
-                <w:b/>
-                <w:bCs/>
-                <w:color w:val="FFFFFF"/>
-                <w:sz w:val="20"/>
-                <w:szCs w:val="20"/>
-              </w:rPr>
-              <w:lastRenderedPageBreak/>
-              <w:t>Tabla</w:t>
-            </w:r>
-          </w:p>
-        </w:tc>
-        <w:tc>
-          <w:tcPr>
-            <w:tcW w:w="2835" w:type="dxa"/>
-            <w:shd w:val="clear" w:color="auto" w:fill="1F4E79"/>
-            <w:tcMar>
-              <w:top w:w="40" w:type="dxa"/>
-              <w:left w:w="80" w:type="dxa"/>
-              <w:bottom w:w="40" w:type="dxa"/>
-              <w:right w:w="80" w:type="dxa"/>
-            </w:tcMar>
-            <w:vAlign w:val="center"/>
-          </w:tcPr>
-          <w:p>
-            <w:pPr>
-              <w:spacing w:after="40"/>
-            </w:pPr>
-            <w:r>
-              <w:rPr>
-                <w:rFonts w:ascii="Calibri" w:eastAsia="Calibri" w:hAnsi="Calibri" w:cs="Calibri"/>
-                <w:b/>
-                <w:bCs/>
-                <w:color w:val="FFFFFF"/>
-                <w:sz w:val="20"/>
-                <w:szCs w:val="20"/>
-              </w:rPr>
-              <w:t>PK</w:t>
-            </w:r>
-          </w:p>
-        </w:tc>
-        <w:tc>
-          <w:tcPr>
-            <w:tcW w:w="4823" w:type="dxa"/>
-            <w:shd w:val="clear" w:color="auto" w:fill="1F4E79"/>
-            <w:tcMar>
-              <w:top w:w="40" w:type="dxa"/>
-              <w:left w:w="80" w:type="dxa"/>
-              <w:bottom w:w="40" w:type="dxa"/>
-              <w:right w:w="80" w:type="dxa"/>
-            </w:tcMar>
-            <w:vAlign w:val="center"/>
-          </w:tcPr>
-          <w:p>
-            <w:pPr>
-              <w:spacing w:after="40"/>
-            </w:pPr>
-            <w:r>
-              <w:rPr>
-                <w:rFonts w:ascii="Calibri" w:eastAsia="Calibri" w:hAnsi="Calibri" w:cs="Calibri"/>
-                <w:b/>
-                <w:bCs/>
-                <w:color w:val="FFFFFF"/>
-                <w:sz w:val="20"/>
-                <w:szCs w:val="20"/>
-              </w:rPr>
-              <w:t>Claves Foráneas (FK)</w:t>
-            </w:r>
-          </w:p>
-        </w:tc>
-      </w:tr>
-      <w:tr>
-        <w:tblPrEx>
-          <w:tblCellMar>
-            <w:top w:w="0" w:type="dxa"/>
-            <w:bottom w:w="0" w:type="dxa"/>
-          </w:tblCellMar>
-        </w:tblPrEx>
-        <w:tc>
-          <w:tcPr>
-            <w:tcW w:w="1980" w:type="dxa"/>
-            <w:tcMar>
-              <w:top w:w="40" w:type="dxa"/>
-              <w:left w:w="80" w:type="dxa"/>
-              <w:bottom w:w="40" w:type="dxa"/>
-              <w:right w:w="80" w:type="dxa"/>
-            </w:tcMar>
-            <w:vAlign w:val="center"/>
-          </w:tcPr>
-          <w:p>
-            <w:pPr>
-              <w:spacing w:after="40"/>
-            </w:pPr>
-            <w:r>
-              <w:t>cliente</w:t>
-            </w:r>
-            <w:r>
-              <w:t>s</w:t>
-            </w:r>
-          </w:p>
-        </w:tc>
-        <w:tc>
-          <w:tcPr>
-            <w:tcW w:w="2835" w:type="dxa"/>
-            <w:tcMar>
-              <w:top w:w="40" w:type="dxa"/>
-              <w:left w:w="80" w:type="dxa"/>
-              <w:bottom w:w="40" w:type="dxa"/>
-              <w:right w:w="80" w:type="dxa"/>
-            </w:tcMar>
-            <w:vAlign w:val="center"/>
-          </w:tcPr>
-          <w:p>
-            <w:pPr>
-              <w:spacing w:after="40"/>
-            </w:pPr>
-            <w:proofErr w:type="spellStart"/>
-            <w:r>
-              <w:rPr>
-                <w:rFonts w:ascii="Calibri" w:eastAsia="Calibri" w:hAnsi="Calibri" w:cs="Calibri"/>
-                <w:sz w:val="20"/>
-                <w:szCs w:val="20"/>
-              </w:rPr>
-              <w:t>id_</w:t>
-            </w:r>
-            <w:r>
-              <w:rPr>
-                <w:rFonts w:ascii="Calibri" w:eastAsia="Calibri" w:hAnsi="Calibri" w:cs="Calibri"/>
-                <w:sz w:val="20"/>
-                <w:szCs w:val="20"/>
-              </w:rPr>
-              <w:t>cliente</w:t>
-            </w:r>
-            <w:proofErr w:type="spellEnd"/>
-          </w:p>
-        </w:tc>
-        <w:tc>
-          <w:tcPr>
-            <w:tcW w:w="4823" w:type="dxa"/>
-            <w:tcMar>
-              <w:top w:w="40" w:type="dxa"/>
-              <w:left w:w="80" w:type="dxa"/>
-              <w:bottom w:w="40" w:type="dxa"/>
-              <w:right w:w="80" w:type="dxa"/>
-            </w:tcMar>
-            <w:vAlign w:val="center"/>
-          </w:tcPr>
-          <w:p>
-            <w:pPr>
-              <w:spacing w:after="40"/>
-            </w:pPr>
-            <w:proofErr w:type="spellStart"/>
-            <w:r>
-              <w:rPr>
-                <w:rFonts w:ascii="Calibri" w:eastAsia="Calibri" w:hAnsi="Calibri" w:cs="Calibri"/>
-                <w:sz w:val="20"/>
-                <w:szCs w:val="20"/>
-              </w:rPr>
-              <w:t>id_paciente</w:t>
-            </w:r>
-            <w:proofErr w:type="spellEnd"/>
-            <w:r>
-              <w:rPr>
-                <w:rFonts w:ascii="Calibri" w:eastAsia="Calibri" w:hAnsi="Calibri" w:cs="Calibri"/>
-                <w:sz w:val="20"/>
-                <w:szCs w:val="20"/>
-              </w:rPr>
-              <w:t xml:space="preserve"> (→ pacientes), </w:t>
-            </w:r>
-            <w:proofErr w:type="spellStart"/>
-            <w:r>
-              <w:rPr>
-                <w:rFonts w:ascii="Calibri" w:eastAsia="Calibri" w:hAnsi="Calibri" w:cs="Calibri"/>
-                <w:sz w:val="20"/>
-                <w:szCs w:val="20"/>
-              </w:rPr>
-              <w:t>id_medico</w:t>
-            </w:r>
-            <w:proofErr w:type="spellEnd"/>
-            <w:r>
-              <w:rPr>
-                <w:rFonts w:ascii="Calibri" w:eastAsia="Calibri" w:hAnsi="Calibri" w:cs="Calibri"/>
-                <w:sz w:val="20"/>
-                <w:szCs w:val="20"/>
-              </w:rPr>
-              <w:t xml:space="preserve"> (→ </w:t>
-            </w:r>
-            <w:proofErr w:type="spellStart"/>
-            <w:r>
-              <w:rPr>
-                <w:rFonts w:ascii="Calibri" w:eastAsia="Calibri" w:hAnsi="Calibri" w:cs="Calibri"/>
-                <w:sz w:val="20"/>
-                <w:szCs w:val="20"/>
-              </w:rPr>
-              <w:t>medicos</w:t>
-            </w:r>
-            <w:proofErr w:type="spellEnd"/>
-            <w:r>
-              <w:rPr>
-                <w:rFonts w:ascii="Calibri" w:eastAsia="Calibri" w:hAnsi="Calibri" w:cs="Calibri"/>
-                <w:sz w:val="20"/>
-                <w:szCs w:val="20"/>
-              </w:rPr>
-              <w:t>)</w:t>
-            </w:r>
-          </w:p>
-        </w:tc>
-      </w:tr>
-      <w:tr>
-        <w:tblPrEx>
-          <w:tblCellMar>
-            <w:top w:w="0" w:type="dxa"/>
-            <w:bottom w:w="0" w:type="dxa"/>
-          </w:tblCellMar>
-        </w:tblPrEx>
-        <w:tc>
-          <w:tcPr>
-            <w:tcW w:w="1980" w:type="dxa"/>
-            <w:tcMar>
-              <w:top w:w="40" w:type="dxa"/>
-              <w:left w:w="80" w:type="dxa"/>
-              <w:bottom w:w="40" w:type="dxa"/>
-              <w:right w:w="80" w:type="dxa"/>
-            </w:tcMar>
-            <w:vAlign w:val="center"/>
-          </w:tcPr>
-          <w:p>
-            <w:pPr>
-              <w:spacing w:after="40"/>
-            </w:pPr>
-            <w:r>
-              <w:t>ventas</w:t>
-            </w:r>
-          </w:p>
-        </w:tc>
-        <w:tc>
-          <w:tcPr>
-            <w:tcW w:w="2835" w:type="dxa"/>
-            <w:tcMar>
-              <w:top w:w="40" w:type="dxa"/>
-              <w:left w:w="80" w:type="dxa"/>
-              <w:bottom w:w="40" w:type="dxa"/>
-              <w:right w:w="80" w:type="dxa"/>
-            </w:tcMar>
-            <w:vAlign w:val="center"/>
-          </w:tcPr>
-          <w:p>
-            <w:pPr>
-              <w:spacing w:after="40"/>
-            </w:pPr>
-            <w:proofErr w:type="spellStart"/>
-            <w:r>
-              <w:t>Id_venta</w:t>
-            </w:r>
-            <w:proofErr w:type="spellEnd"/>
-          </w:p>
-        </w:tc>
-        <w:tc>
-          <w:tcPr>
-            <w:tcW w:w="4823" w:type="dxa"/>
-            <w:tcMar>
-              <w:top w:w="40" w:type="dxa"/>
-              <w:left w:w="80" w:type="dxa"/>
-              <w:bottom w:w="40" w:type="dxa"/>
-              <w:right w:w="80" w:type="dxa"/>
-            </w:tcMar>
-            <w:vAlign w:val="center"/>
-          </w:tcPr>
-          <w:p>
-            <w:pPr>
-              <w:spacing w:after="40"/>
-            </w:pPr>
-            <w:proofErr w:type="spellStart"/>
-            <w:r>
-              <w:rPr>
-                <w:rFonts w:ascii="Calibri" w:eastAsia="Calibri" w:hAnsi="Calibri" w:cs="Calibri"/>
-                <w:sz w:val="20"/>
-                <w:szCs w:val="20"/>
-              </w:rPr>
-              <w:t>id_</w:t>
-            </w:r>
-            <w:proofErr w:type="gramStart"/>
-            <w:r>
-              <w:rPr>
-                <w:rFonts w:ascii="Calibri" w:eastAsia="Calibri" w:hAnsi="Calibri" w:cs="Calibri"/>
-                <w:sz w:val="20"/>
-                <w:szCs w:val="20"/>
-              </w:rPr>
-              <w:t>cliente</w:t>
-            </w:r>
-            <w:proofErr w:type="spellEnd"/>
-            <w:r>
-              <w:rPr>
-                <w:rFonts w:ascii="Calibri" w:eastAsia="Calibri" w:hAnsi="Calibri" w:cs="Calibri"/>
-                <w:sz w:val="20"/>
-                <w:szCs w:val="20"/>
-              </w:rPr>
-              <w:t>(</w:t>
-            </w:r>
-            <w:proofErr w:type="gramEnd"/>
-            <w:r>
-              <w:rPr>
-                <w:rFonts w:ascii="Calibri" w:eastAsia="Calibri" w:hAnsi="Calibri" w:cs="Calibri"/>
-                <w:sz w:val="20"/>
-                <w:szCs w:val="20"/>
-              </w:rPr>
-              <w:t xml:space="preserve">→ </w:t>
-            </w:r>
-            <w:r>
-              <w:rPr>
-                <w:rFonts w:ascii="Calibri" w:eastAsia="Calibri" w:hAnsi="Calibri" w:cs="Calibri"/>
-                <w:sz w:val="20"/>
-                <w:szCs w:val="20"/>
-              </w:rPr>
-              <w:t>clientes</w:t>
-            </w:r>
-            <w:r>
-              <w:rPr>
-                <w:rFonts w:ascii="Calibri" w:eastAsia="Calibri" w:hAnsi="Calibri" w:cs="Calibri"/>
-                <w:sz w:val="20"/>
-                <w:szCs w:val="20"/>
-              </w:rPr>
-              <w:t>)</w:t>
-            </w:r>
-          </w:p>
-        </w:tc>
-      </w:tr>
-      <w:tr>
-        <w:tblPrEx>
-          <w:tblCellMar>
-            <w:top w:w="0" w:type="dxa"/>
-            <w:bottom w:w="0" w:type="dxa"/>
-          </w:tblCellMar>
-        </w:tblPrEx>
-        <w:tc>
-          <w:tcPr>
-            <w:tcW w:w="1980" w:type="dxa"/>
-            <w:tcMar>
-              <w:top w:w="40" w:type="dxa"/>
-              <w:left w:w="80" w:type="dxa"/>
-              <w:bottom w:w="40" w:type="dxa"/>
-              <w:right w:w="80" w:type="dxa"/>
-            </w:tcMar>
-            <w:vAlign w:val="center"/>
-          </w:tcPr>
-          <w:p>
-            <w:pPr>
-              <w:spacing w:after="40"/>
-            </w:pPr>
-            <w:proofErr w:type="spellStart"/>
-            <w:r>
-              <w:t>Detalle_venta</w:t>
-            </w:r>
-            <w:proofErr w:type="spellEnd"/>
-          </w:p>
-        </w:tc>
-        <w:tc>
-          <w:tcPr>
-            <w:tcW w:w="2835" w:type="dxa"/>
-            <w:tcMar>
-              <w:top w:w="40" w:type="dxa"/>
-              <w:left w:w="80" w:type="dxa"/>
-              <w:bottom w:w="40" w:type="dxa"/>
-              <w:right w:w="80" w:type="dxa"/>
-            </w:tcMar>
-            <w:vAlign w:val="center"/>
-          </w:tcPr>
-          <w:p>
-            <w:pPr>
-              <w:spacing w:after="40"/>
-            </w:pPr>
-            <w:proofErr w:type="spellStart"/>
-            <w:r>
-              <w:t>Id_</w:t>
-            </w:r>
-            <w:r>
-              <w:t>venta</w:t>
-            </w:r>
-            <w:proofErr w:type="spellEnd"/>
-            <w:r>
-              <w:t xml:space="preserve">, </w:t>
-            </w:r>
-            <w:proofErr w:type="spellStart"/>
-            <w:r>
-              <w:t>id_producto</w:t>
-            </w:r>
-            <w:proofErr w:type="spellEnd"/>
-          </w:p>
-        </w:tc>
-        <w:tc>
-          <w:tcPr>
-            <w:tcW w:w="4823" w:type="dxa"/>
-            <w:tcMar>
-              <w:top w:w="40" w:type="dxa"/>
-              <w:left w:w="80" w:type="dxa"/>
-              <w:bottom w:w="40" w:type="dxa"/>
-              <w:right w:w="80" w:type="dxa"/>
-            </w:tcMar>
-            <w:vAlign w:val="center"/>
-          </w:tcPr>
-          <w:p>
-            <w:pPr>
-              <w:spacing w:after="40"/>
-            </w:pPr>
-            <w:proofErr w:type="spellStart"/>
-            <w:r>
-              <w:t>Id_venta</w:t>
-            </w:r>
-            <w:proofErr w:type="spellEnd"/>
-            <w:r>
-              <w:t xml:space="preserve"> (-&gt; ventas)</w:t>
-            </w:r>
-            <w:r>
-              <w:t xml:space="preserve">, </w:t>
-            </w:r>
-            <w:proofErr w:type="spellStart"/>
-            <w:r>
-              <w:t>id_producto</w:t>
-            </w:r>
-            <w:proofErr w:type="spellEnd"/>
-            <w:r>
-              <w:t xml:space="preserve"> </w:t>
-            </w:r>
-            <w:r>
-              <w:t xml:space="preserve">(-&gt; </w:t>
-            </w:r>
-            <w:r>
-              <w:t>producto</w:t>
-            </w:r>
-            <w:r>
-              <w:t>)</w:t>
-            </w:r>
-          </w:p>
-        </w:tc>
-      </w:tr>
-      <w:tr>
-        <w:tblPrEx>
-          <w:tblCellMar>
-            <w:top w:w="0" w:type="dxa"/>
-            <w:bottom w:w="0" w:type="dxa"/>
-          </w:tblCellMar>
-        </w:tblPrEx>
-        <w:tc>
-          <w:tcPr>
-            <w:tcW w:w="1980" w:type="dxa"/>
-            <w:tcMar>
-              <w:top w:w="40" w:type="dxa"/>
-              <w:left w:w="80" w:type="dxa"/>
-              <w:bottom w:w="40" w:type="dxa"/>
-              <w:right w:w="80" w:type="dxa"/>
-            </w:tcMar>
-            <w:vAlign w:val="center"/>
-          </w:tcPr>
-          <w:p>
-            <w:pPr>
-              <w:spacing w:after="40"/>
-            </w:pPr>
-            <w:r>
-              <w:t>Productos</w:t>
-            </w:r>
-          </w:p>
-        </w:tc>
-        <w:tc>
-          <w:tcPr>
-            <w:tcW w:w="2835" w:type="dxa"/>
-            <w:tcMar>
-              <w:top w:w="40" w:type="dxa"/>
-              <w:left w:w="80" w:type="dxa"/>
-              <w:bottom w:w="40" w:type="dxa"/>
-              <w:right w:w="80" w:type="dxa"/>
-            </w:tcMar>
-            <w:vAlign w:val="center"/>
-          </w:tcPr>
-          <w:p>
-            <w:pPr>
-              <w:spacing w:after="40"/>
-            </w:pPr>
-            <w:proofErr w:type="spellStart"/>
-            <w:r>
-              <w:t>Id_producto</w:t>
-            </w:r>
-            <w:proofErr w:type="spellEnd"/>
-          </w:p>
-        </w:tc>
-        <w:tc>
-          <w:tcPr>
-            <w:tcW w:w="4823" w:type="dxa"/>
-            <w:tcMar>
-              <w:top w:w="40" w:type="dxa"/>
-              <w:left w:w="80" w:type="dxa"/>
-              <w:bottom w:w="40" w:type="dxa"/>
-              <w:right w:w="80" w:type="dxa"/>
-            </w:tcMar>
-            <w:vAlign w:val="center"/>
-          </w:tcPr>
-          <w:p>
-            <w:pPr>
-              <w:spacing w:after="40"/>
-            </w:pPr>
-          </w:p>
-        </w:tc>
-      </w:tr>
-      <w:tr>
-        <w:tblPrEx>
-          <w:tblCellMar>
-            <w:top w:w="0" w:type="dxa"/>
-            <w:bottom w:w="0" w:type="dxa"/>
-          </w:tblCellMar>
-        </w:tblPrEx>
-        <w:tc>
-          <w:tcPr>
-            <w:tcW w:w="1980" w:type="dxa"/>
-            <w:tcMar>
-              <w:top w:w="40" w:type="dxa"/>
-              <w:left w:w="80" w:type="dxa"/>
-              <w:bottom w:w="40" w:type="dxa"/>
-              <w:right w:w="80" w:type="dxa"/>
-            </w:tcMar>
-            <w:vAlign w:val="center"/>
-          </w:tcPr>
-          <w:p>
-            <w:pPr>
-              <w:spacing w:after="40"/>
-            </w:pPr>
-            <w:r>
-              <w:t>Insumos</w:t>
-            </w:r>
-          </w:p>
-        </w:tc>
-        <w:tc>
-          <w:tcPr>
-            <w:tcW w:w="2835" w:type="dxa"/>
-            <w:tcMar>
-              <w:top w:w="40" w:type="dxa"/>
-              <w:left w:w="80" w:type="dxa"/>
-              <w:bottom w:w="40" w:type="dxa"/>
-              <w:right w:w="80" w:type="dxa"/>
-            </w:tcMar>
-            <w:vAlign w:val="center"/>
-          </w:tcPr>
-          <w:p>
-            <w:pPr>
-              <w:spacing w:after="40"/>
-            </w:pPr>
-            <w:proofErr w:type="spellStart"/>
-            <w:r>
-              <w:t>Id_insumo</w:t>
-            </w:r>
-            <w:proofErr w:type="spellEnd"/>
-          </w:p>
-        </w:tc>
-        <w:tc>
-          <w:tcPr>
-            <w:tcW w:w="4823" w:type="dxa"/>
-            <w:tcMar>
-              <w:top w:w="40" w:type="dxa"/>
-              <w:left w:w="80" w:type="dxa"/>
-              <w:bottom w:w="40" w:type="dxa"/>
-              <w:right w:w="80" w:type="dxa"/>
-            </w:tcMar>
-            <w:vAlign w:val="center"/>
-          </w:tcPr>
-          <w:p>
-            <w:pPr>
-              <w:spacing w:after="40"/>
-            </w:pPr>
-          </w:p>
-        </w:tc>
-      </w:tr>
-      <w:tr>
-        <w:tblPrEx>
-          <w:tblCellMar>
-            <w:top w:w="0" w:type="dxa"/>
-            <w:bottom w:w="0" w:type="dxa"/>
-          </w:tblCellMar>
-        </w:tblPrEx>
-        <w:tc>
-          <w:tcPr>
-            <w:tcW w:w="1980" w:type="dxa"/>
-            <w:tcMar>
-              <w:top w:w="40" w:type="dxa"/>
-              <w:left w:w="80" w:type="dxa"/>
-              <w:bottom w:w="40" w:type="dxa"/>
-              <w:right w:w="80" w:type="dxa"/>
-            </w:tcMar>
-            <w:vAlign w:val="center"/>
-          </w:tcPr>
-          <w:p>
-            <w:pPr>
-              <w:spacing w:after="40"/>
-            </w:pPr>
-            <w:r>
-              <w:t>Compras</w:t>
-            </w:r>
-          </w:p>
-        </w:tc>
-        <w:tc>
-          <w:tcPr>
-            <w:tcW w:w="2835" w:type="dxa"/>
-            <w:tcMar>
-              <w:top w:w="40" w:type="dxa"/>
-              <w:left w:w="80" w:type="dxa"/>
-              <w:bottom w:w="40" w:type="dxa"/>
-              <w:right w:w="80" w:type="dxa"/>
-            </w:tcMar>
-            <w:vAlign w:val="center"/>
-          </w:tcPr>
-          <w:p>
-            <w:pPr>
-              <w:spacing w:after="40"/>
-            </w:pPr>
-            <w:proofErr w:type="spellStart"/>
-            <w:r>
-              <w:t>Id_compra</w:t>
-            </w:r>
-            <w:proofErr w:type="spellEnd"/>
-          </w:p>
-        </w:tc>
-        <w:tc>
-          <w:tcPr>
-            <w:tcW w:w="4823" w:type="dxa"/>
-            <w:tcMar>
-              <w:top w:w="40" w:type="dxa"/>
-              <w:left w:w="80" w:type="dxa"/>
-              <w:bottom w:w="40" w:type="dxa"/>
-              <w:right w:w="80" w:type="dxa"/>
-            </w:tcMar>
-            <w:vAlign w:val="center"/>
-          </w:tcPr>
-          <w:p>
-            <w:pPr>
-              <w:spacing w:after="40"/>
-            </w:pPr>
-          </w:p>
-        </w:tc>
-      </w:tr>
-      <w:tr>
-        <w:tblPrEx>
-          <w:tblCellMar>
-            <w:top w:w="0" w:type="dxa"/>
-            <w:bottom w:w="0" w:type="dxa"/>
-          </w:tblCellMar>
-        </w:tblPrEx>
-        <w:tc>
-          <w:tcPr>
-            <w:tcW w:w="1980" w:type="dxa"/>
-            <w:tcMar>
-              <w:top w:w="40" w:type="dxa"/>
-              <w:left w:w="80" w:type="dxa"/>
-              <w:bottom w:w="40" w:type="dxa"/>
-              <w:right w:w="80" w:type="dxa"/>
-            </w:tcMar>
-            <w:vAlign w:val="center"/>
-          </w:tcPr>
-          <w:p>
-            <w:pPr>
-              <w:spacing w:after="40"/>
-            </w:pPr>
-            <w:r>
-              <w:t>Proveedores</w:t>
-            </w:r>
-          </w:p>
-        </w:tc>
-        <w:tc>
-          <w:tcPr>
-            <w:tcW w:w="2835" w:type="dxa"/>
-            <w:tcMar>
-              <w:top w:w="40" w:type="dxa"/>
-              <w:left w:w="80" w:type="dxa"/>
-              <w:bottom w:w="40" w:type="dxa"/>
-              <w:right w:w="80" w:type="dxa"/>
-            </w:tcMar>
-            <w:vAlign w:val="center"/>
-          </w:tcPr>
-          <w:p>
-            <w:pPr>
-              <w:spacing w:after="40"/>
-            </w:pPr>
-            <w:proofErr w:type="spellStart"/>
-            <w:r>
-              <w:t>Id_proveedor</w:t>
-            </w:r>
-            <w:proofErr w:type="spellEnd"/>
-          </w:p>
-        </w:tc>
-        <w:tc>
-          <w:tcPr>
-            <w:tcW w:w="4823" w:type="dxa"/>
-            <w:tcMar>
-              <w:top w:w="40" w:type="dxa"/>
-              <w:left w:w="80" w:type="dxa"/>
-              <w:bottom w:w="40" w:type="dxa"/>
-              <w:right w:w="80" w:type="dxa"/>
-            </w:tcMar>
-            <w:vAlign w:val="center"/>
-          </w:tcPr>
-          <w:p>
-            <w:pPr>
-              <w:spacing w:after="40"/>
-            </w:pPr>
-          </w:p>
-        </w:tc>
-      </w:tr>
-    </w:tbl>
-    <w:p>
-      <w:pPr>
-        <w:spacing w:after="80"/>
-      </w:pPr>
-      <w:r>
-        <w:t>Consultar a la profesora :D</w:t>
-      </w:r>
-    </w:p>
-    <w:p>
-      <w:pPr>
-        <w:pStyle w:val="Ttulo3"/>
-        <w:spacing w:before="240" w:after="120"/>
-      </w:pPr>
-      <w:r>
-        <w:rPr>
-          <w:rFonts w:ascii="Calibri" w:eastAsia="Calibri" w:hAnsi="Calibri" w:cs="Calibri"/>
-          <w:b/>
-          <w:bCs/>
-          <w:color w:val="1F4E79"/>
-          <w:sz w:val="22"/>
-          <w:szCs w:val="22"/>
-        </w:rPr>
-        <w:t xml:space="preserve">6 </w:t>
-      </w:r>
-      <w:proofErr w:type="gramStart"/>
-      <w:r>
-        <w:rPr>
-          <w:rFonts w:ascii="Calibri" w:eastAsia="Calibri" w:hAnsi="Calibri" w:cs="Calibri"/>
-          <w:b/>
-          <w:bCs/>
-          <w:color w:val="1F4E79"/>
-          <w:sz w:val="22"/>
-          <w:szCs w:val="22"/>
-        </w:rPr>
-        <w:t>Consideraciones</w:t>
-      </w:r>
-      <w:proofErr w:type="gramEnd"/>
-      <w:r>
-        <w:rPr>
-          <w:rFonts w:ascii="Calibri" w:eastAsia="Calibri" w:hAnsi="Calibri" w:cs="Calibri"/>
-          <w:b/>
-          <w:bCs/>
-          <w:color w:val="1F4E79"/>
-          <w:sz w:val="22"/>
-          <w:szCs w:val="22"/>
-        </w:rPr>
-        <w:t xml:space="preserve"> de Seguridad y Automatización</w:t>
+        <w:t>6 Consideraciones de Seguridad y Automatización</w:t>
       </w:r>
     </w:p>
     <w:p>
@@ -4358,12 +3073,6 @@
         <w:gridCol w:w="5138"/>
       </w:tblGrid>
       <w:tr>
-        <w:tblPrEx>
-          <w:tblCellMar>
-            <w:top w:w="0" w:type="dxa"/>
-            <w:bottom w:w="0" w:type="dxa"/>
-          </w:tblCellMar>
-        </w:tblPrEx>
         <w:tc>
           <w:tcPr>
             <w:tcW w:w="4500" w:type="dxa"/>
@@ -4388,9 +3097,48 @@
                 <w:sz w:val="20"/>
                 <w:szCs w:val="20"/>
               </w:rPr>
-              <w:t xml:space="preserve">¿Quién podrá ver toda la información? (Rol </w:t>
-            </w:r>
-            <w:proofErr w:type="spellStart"/>
+              <w:t>¿Quién podrá ver toda la información? (Rol Admin)</w:t>
+            </w:r>
+          </w:p>
+        </w:tc>
+        <w:tc>
+          <w:tcPr>
+            <w:tcW w:w="5138" w:type="dxa"/>
+            <w:tcMar>
+              <w:top w:w="40" w:type="dxa"/>
+              <w:left w:w="80" w:type="dxa"/>
+              <w:bottom w:w="40" w:type="dxa"/>
+              <w:right w:w="80" w:type="dxa"/>
+            </w:tcMar>
+            <w:vAlign w:val="center"/>
+          </w:tcPr>
+          <w:p>
+            <w:pPr>
+              <w:spacing w:after="40"/>
+            </w:pPr>
+            <w:r>
+              <w:t>Administrador</w:t>
+            </w:r>
+          </w:p>
+        </w:tc>
+      </w:tr>
+      <w:tr>
+        <w:tc>
+          <w:tcPr>
+            <w:tcW w:w="4500" w:type="dxa"/>
+            <w:shd w:val="clear" w:color="auto" w:fill="F2F2F2"/>
+            <w:tcMar>
+              <w:top w:w="40" w:type="dxa"/>
+              <w:left w:w="80" w:type="dxa"/>
+              <w:bottom w:w="40" w:type="dxa"/>
+              <w:right w:w="80" w:type="dxa"/>
+            </w:tcMar>
+            <w:vAlign w:val="center"/>
+          </w:tcPr>
+          <w:p>
+            <w:pPr>
+              <w:spacing w:after="40"/>
+            </w:pPr>
             <w:r>
               <w:rPr>
                 <w:rFonts w:ascii="Calibri" w:eastAsia="Calibri" w:hAnsi="Calibri" w:cs="Calibri"/>
@@ -4399,9 +3147,51 @@
                 <w:sz w:val="20"/>
                 <w:szCs w:val="20"/>
               </w:rPr>
-              <w:t>Admin</w:t>
-            </w:r>
-            <w:proofErr w:type="spellEnd"/>
+              <w:t>¿Quién solo podrá consultar o cargar datos? (Rol Usuario)</w:t>
+            </w:r>
+          </w:p>
+        </w:tc>
+        <w:tc>
+          <w:tcPr>
+            <w:tcW w:w="5138" w:type="dxa"/>
+            <w:tcMar>
+              <w:top w:w="40" w:type="dxa"/>
+              <w:left w:w="80" w:type="dxa"/>
+              <w:bottom w:w="40" w:type="dxa"/>
+              <w:right w:w="80" w:type="dxa"/>
+            </w:tcMar>
+            <w:vAlign w:val="center"/>
+          </w:tcPr>
+          <w:p>
+            <w:pPr>
+              <w:spacing w:after="40"/>
+            </w:pPr>
+            <w:r>
+              <w:t>Operarios</w:t>
+            </w:r>
+            <w:r>
+              <w:t>.</w:t>
+            </w:r>
+          </w:p>
+        </w:tc>
+      </w:tr>
+      <w:tr>
+        <w:tc>
+          <w:tcPr>
+            <w:tcW w:w="4500" w:type="dxa"/>
+            <w:shd w:val="clear" w:color="auto" w:fill="F2F2F2"/>
+            <w:tcMar>
+              <w:top w:w="40" w:type="dxa"/>
+              <w:left w:w="80" w:type="dxa"/>
+              <w:bottom w:w="40" w:type="dxa"/>
+              <w:right w:w="80" w:type="dxa"/>
+            </w:tcMar>
+            <w:vAlign w:val="center"/>
+          </w:tcPr>
+          <w:p>
+            <w:pPr>
+              <w:spacing w:after="40"/>
+            </w:pPr>
             <w:r>
               <w:rPr>
                 <w:rFonts w:ascii="Calibri" w:eastAsia="Calibri" w:hAnsi="Calibri" w:cs="Calibri"/>
@@ -4410,7 +3200,7 @@
                 <w:sz w:val="20"/>
                 <w:szCs w:val="20"/>
               </w:rPr>
-              <w:t>)</w:t>
+              <w:t>¿Qué acción debería disparar un registro automático? (Trigger)</w:t>
             </w:r>
           </w:p>
         </w:tc>
@@ -4430,141 +3220,15 @@
               <w:spacing w:after="40"/>
             </w:pPr>
             <w:r>
-              <w:t>Administrador</w:t>
+              <w:t>La escases de un insumo</w:t>
+            </w:r>
+            <w:r>
+              <w:t>.</w:t>
             </w:r>
           </w:p>
         </w:tc>
       </w:tr>
       <w:tr>
-        <w:tblPrEx>
-          <w:tblCellMar>
-            <w:top w:w="0" w:type="dxa"/>
-            <w:bottom w:w="0" w:type="dxa"/>
-          </w:tblCellMar>
-        </w:tblPrEx>
-        <w:tc>
-          <w:tcPr>
-            <w:tcW w:w="4500" w:type="dxa"/>
-            <w:shd w:val="clear" w:color="auto" w:fill="F2F2F2"/>
-            <w:tcMar>
-              <w:top w:w="40" w:type="dxa"/>
-              <w:left w:w="80" w:type="dxa"/>
-              <w:bottom w:w="40" w:type="dxa"/>
-              <w:right w:w="80" w:type="dxa"/>
-            </w:tcMar>
-            <w:vAlign w:val="center"/>
-          </w:tcPr>
-          <w:p>
-            <w:pPr>
-              <w:spacing w:after="40"/>
-            </w:pPr>
-            <w:r>
-              <w:rPr>
-                <w:rFonts w:ascii="Calibri" w:eastAsia="Calibri" w:hAnsi="Calibri" w:cs="Calibri"/>
-                <w:b/>
-                <w:bCs/>
-                <w:sz w:val="20"/>
-                <w:szCs w:val="20"/>
-              </w:rPr>
-              <w:t>¿Quién solo podrá consultar o cargar datos? (Rol Usuario)</w:t>
-            </w:r>
-          </w:p>
-        </w:tc>
-        <w:tc>
-          <w:tcPr>
-            <w:tcW w:w="5138" w:type="dxa"/>
-            <w:tcMar>
-              <w:top w:w="40" w:type="dxa"/>
-              <w:left w:w="80" w:type="dxa"/>
-              <w:bottom w:w="40" w:type="dxa"/>
-              <w:right w:w="80" w:type="dxa"/>
-            </w:tcMar>
-            <w:vAlign w:val="center"/>
-          </w:tcPr>
-          <w:p>
-            <w:pPr>
-              <w:spacing w:after="40"/>
-            </w:pPr>
-            <w:r>
-              <w:t>Operarios</w:t>
-            </w:r>
-            <w:r>
-              <w:t>.</w:t>
-            </w:r>
-          </w:p>
-        </w:tc>
-      </w:tr>
-      <w:tr>
-        <w:tblPrEx>
-          <w:tblCellMar>
-            <w:top w:w="0" w:type="dxa"/>
-            <w:bottom w:w="0" w:type="dxa"/>
-          </w:tblCellMar>
-        </w:tblPrEx>
-        <w:tc>
-          <w:tcPr>
-            <w:tcW w:w="4500" w:type="dxa"/>
-            <w:shd w:val="clear" w:color="auto" w:fill="F2F2F2"/>
-            <w:tcMar>
-              <w:top w:w="40" w:type="dxa"/>
-              <w:left w:w="80" w:type="dxa"/>
-              <w:bottom w:w="40" w:type="dxa"/>
-              <w:right w:w="80" w:type="dxa"/>
-            </w:tcMar>
-            <w:vAlign w:val="center"/>
-          </w:tcPr>
-          <w:p>
-            <w:pPr>
-              <w:spacing w:after="40"/>
-            </w:pPr>
-            <w:r>
-              <w:rPr>
-                <w:rFonts w:ascii="Calibri" w:eastAsia="Calibri" w:hAnsi="Calibri" w:cs="Calibri"/>
-                <w:b/>
-                <w:bCs/>
-                <w:sz w:val="20"/>
-                <w:szCs w:val="20"/>
-              </w:rPr>
-              <w:t>¿Qué acción debería disparar un registro automático? (Trigger)</w:t>
-            </w:r>
-          </w:p>
-        </w:tc>
-        <w:tc>
-          <w:tcPr>
-            <w:tcW w:w="5138" w:type="dxa"/>
-            <w:tcMar>
-              <w:top w:w="40" w:type="dxa"/>
-              <w:left w:w="80" w:type="dxa"/>
-              <w:bottom w:w="40" w:type="dxa"/>
-              <w:right w:w="80" w:type="dxa"/>
-            </w:tcMar>
-            <w:vAlign w:val="center"/>
-          </w:tcPr>
-          <w:p>
-            <w:pPr>
-              <w:spacing w:after="40"/>
-            </w:pPr>
-            <w:proofErr w:type="gramStart"/>
-            <w:r>
-              <w:t>La escases</w:t>
-            </w:r>
-            <w:proofErr w:type="gramEnd"/>
-            <w:r>
-              <w:t xml:space="preserve"> de un insumo</w:t>
-            </w:r>
-            <w:r>
-              <w:t>.</w:t>
-            </w:r>
-          </w:p>
-        </w:tc>
-      </w:tr>
-      <w:tr>
-        <w:tblPrEx>
-          <w:tblCellMar>
-            <w:top w:w="0" w:type="dxa"/>
-            <w:bottom w:w="0" w:type="dxa"/>
-          </w:tblCellMar>
-        </w:tblPrEx>
         <w:tc>
           <w:tcPr>
             <w:tcW w:w="4500" w:type="dxa"/>
@@ -5884,6 +4548,7 @@
   <w:style w:type="character" w:default="1" w:styleId="Fuentedeprrafopredeter">
     <w:name w:val="Default Paragraph Font"/>
     <w:uiPriority w:val="1"/>
+    <w:semiHidden/>
     <w:unhideWhenUsed/>
   </w:style>
   <w:style w:type="table" w:default="1" w:styleId="Tablanormal">

</xml_diff>